<commit_message>
updated models for 2010
</commit_message>
<xml_diff>
--- a/model_fitting/2010 2/Binary_Logistic_Report.docx
+++ b/model_fitting/2010 2/Binary_Logistic_Report.docx
@@ -12,7 +12,7 @@
     </w:p>
     <w:p>
       <w:r>
-        <w:t>Generated on: 2026-05-06 04:23:40</w:t>
+        <w:t>Generated on: 2026-05-07 21:51:45</w:t>
       </w:r>
     </w:p>
     <w:p>
@@ -7829,12 +7829,29 @@
         <w:pStyle w:val="Heading1"/>
       </w:pPr>
       <w:r>
-        <w:t>7.3 Forest Plot - Odds Ratios Visualization</w:t>
+        <w:t>7.2 Odds Ratios - Binary Logistic Regression</w:t>
       </w:r>
     </w:p>
     <w:p>
       <w:r>
-        <w:t>The forest plot visualizes the odds ratios (OR) and their 95% confidence intervals for each predictor variable in the binary logistic regression model. The vertical dashed line at OR = 1 represents no effect. Points to the right of this line indicate positive associations (higher odds of being first-born), while points to the left indicate negative associations (lower odds of being first-born).</w:t>
+        <w:t>Odds Ratios (OR) are derived by exponentiating the coefficients from the binary logistic regression model. They represent the multiplicative effect on the odds of being first-born versus later-born.</w:t>
+      </w:r>
+    </w:p>
+    <w:p>
+      <w:pPr>
+        <w:pStyle w:val="IntenseQuote"/>
+      </w:pPr>
+      <w:r>
+        <w:t>Interpretation guidelines:</w:t>
+        <w:br/>
+        <w:t>• OR = 1.00: No effect on the odds of being first-born</w:t>
+        <w:br/>
+        <w:t>• OR &gt; 1.00: Associated with HIGHER odds of being first-born</w:t>
+        <w:br/>
+        <w:t>• OR &lt; 1.00: Associated with LOWER odds of being first-born (higher odds of being later-born)</w:t>
+        <w:br/>
+        <w:br/>
+        <w:t>For a one-unit increase in the predictor, the odds of being first-born are multiplied by the OR.</w:t>
       </w:r>
     </w:p>
     <w:p>
@@ -7842,53 +7859,1549 @@
         <w:pStyle w:val="Heading2"/>
       </w:pPr>
       <w:r>
-        <w:t>Key Observations</w:t>
+        <w:t>Complete Odds Ratios Table</w:t>
       </w:r>
     </w:p>
+    <w:tbl>
+      <w:tblPr>
+        <w:tblStyle w:val="LightGrid-Accent1"/>
+        <w:tblW w:type="auto" w:w="0"/>
+        <w:tblLayout w:type="fixed"/>
+        <w:tblLook w:firstColumn="1" w:firstRow="1" w:lastColumn="0" w:lastRow="0" w:noHBand="0" w:noVBand="1" w:val="04A0"/>
+      </w:tblPr>
+      <w:tblGrid>
+        <w:gridCol w:w="2592"/>
+        <w:gridCol w:w="1152"/>
+        <w:gridCol w:w="1152"/>
+        <w:gridCol w:w="1152"/>
+        <w:gridCol w:w="1296"/>
+        <w:gridCol w:w="864"/>
+      </w:tblGrid>
+      <w:tr>
+        <w:tc>
+          <w:tcPr>
+            <w:tcW w:type="dxa" w:w="1440"/>
+          </w:tcPr>
+          <w:p>
+            <w:pPr>
+              <w:jc w:val="center"/>
+            </w:pPr>
+            <w:r>
+              <w:rPr>
+                <w:b/>
+              </w:rPr>
+              <w:t>Variable</w:t>
+            </w:r>
+          </w:p>
+        </w:tc>
+        <w:tc>
+          <w:tcPr>
+            <w:tcW w:type="dxa" w:w="1440"/>
+          </w:tcPr>
+          <w:p>
+            <w:pPr>
+              <w:jc w:val="center"/>
+            </w:pPr>
+            <w:r>
+              <w:rPr>
+                <w:b/>
+              </w:rPr>
+              <w:t>Odds Ratio</w:t>
+            </w:r>
+          </w:p>
+        </w:tc>
+        <w:tc>
+          <w:tcPr>
+            <w:tcW w:type="dxa" w:w="1440"/>
+          </w:tcPr>
+          <w:p>
+            <w:pPr>
+              <w:jc w:val="center"/>
+            </w:pPr>
+            <w:r>
+              <w:rPr>
+                <w:b/>
+              </w:rPr>
+              <w:t>CI Lower</w:t>
+            </w:r>
+          </w:p>
+        </w:tc>
+        <w:tc>
+          <w:tcPr>
+            <w:tcW w:type="dxa" w:w="1440"/>
+          </w:tcPr>
+          <w:p>
+            <w:pPr>
+              <w:jc w:val="center"/>
+            </w:pPr>
+            <w:r>
+              <w:rPr>
+                <w:b/>
+              </w:rPr>
+              <w:t>CI Upper</w:t>
+            </w:r>
+          </w:p>
+        </w:tc>
+        <w:tc>
+          <w:tcPr>
+            <w:tcW w:type="dxa" w:w="1440"/>
+          </w:tcPr>
+          <w:p>
+            <w:pPr>
+              <w:jc w:val="center"/>
+            </w:pPr>
+            <w:r>
+              <w:rPr>
+                <w:b/>
+              </w:rPr>
+              <w:t>p-value</w:t>
+            </w:r>
+          </w:p>
+        </w:tc>
+        <w:tc>
+          <w:tcPr>
+            <w:tcW w:type="dxa" w:w="1440"/>
+          </w:tcPr>
+          <w:p>
+            <w:pPr>
+              <w:jc w:val="center"/>
+            </w:pPr>
+            <w:r>
+              <w:rPr>
+                <w:b/>
+              </w:rPr>
+              <w:t>Sig</w:t>
+            </w:r>
+          </w:p>
+        </w:tc>
+      </w:tr>
+      <w:tr>
+        <w:tc>
+          <w:tcPr>
+            <w:tcW w:type="dxa" w:w="1440"/>
+          </w:tcPr>
+          <w:p>
+            <w:r>
+              <w:rPr>
+                <w:b/>
+              </w:rPr>
+              <w:t>age_group_20-24</w:t>
+            </w:r>
+          </w:p>
+        </w:tc>
+        <w:tc>
+          <w:tcPr>
+            <w:tcW w:type="dxa" w:w="1440"/>
+          </w:tcPr>
+          <w:p>
+            <w:r>
+              <w:rPr>
+                <w:b/>
+                <w:color w:val="0066CC"/>
+              </w:rPr>
+              <w:t>0.182</w:t>
+            </w:r>
+          </w:p>
+        </w:tc>
+        <w:tc>
+          <w:tcPr>
+            <w:tcW w:type="dxa" w:w="1440"/>
+          </w:tcPr>
+          <w:p>
+            <w:r>
+              <w:rPr>
+                <w:b/>
+              </w:rPr>
+              <w:t>0.171</w:t>
+            </w:r>
+          </w:p>
+        </w:tc>
+        <w:tc>
+          <w:tcPr>
+            <w:tcW w:type="dxa" w:w="1440"/>
+          </w:tcPr>
+          <w:p>
+            <w:r>
+              <w:rPr>
+                <w:b/>
+              </w:rPr>
+              <w:t>0.193</w:t>
+            </w:r>
+          </w:p>
+        </w:tc>
+        <w:tc>
+          <w:tcPr>
+            <w:tcW w:type="dxa" w:w="1440"/>
+          </w:tcPr>
+          <w:p>
+            <w:r>
+              <w:rPr>
+                <w:b/>
+              </w:rPr>
+              <w:t>0.0000</w:t>
+            </w:r>
+          </w:p>
+        </w:tc>
+        <w:tc>
+          <w:tcPr>
+            <w:tcW w:type="dxa" w:w="1440"/>
+          </w:tcPr>
+          <w:p>
+            <w:r>
+              <w:t>***</w:t>
+            </w:r>
+          </w:p>
+        </w:tc>
+      </w:tr>
+      <w:tr>
+        <w:tc>
+          <w:tcPr>
+            <w:tcW w:type="dxa" w:w="1440"/>
+          </w:tcPr>
+          <w:p>
+            <w:r>
+              <w:rPr>
+                <w:b/>
+              </w:rPr>
+              <w:t>age_group_25-29</w:t>
+            </w:r>
+          </w:p>
+        </w:tc>
+        <w:tc>
+          <w:tcPr>
+            <w:tcW w:type="dxa" w:w="1440"/>
+          </w:tcPr>
+          <w:p>
+            <w:r>
+              <w:rPr>
+                <w:b/>
+                <w:color w:val="0066CC"/>
+              </w:rPr>
+              <w:t>0.062</w:t>
+            </w:r>
+          </w:p>
+        </w:tc>
+        <w:tc>
+          <w:tcPr>
+            <w:tcW w:type="dxa" w:w="1440"/>
+          </w:tcPr>
+          <w:p>
+            <w:r>
+              <w:rPr>
+                <w:b/>
+              </w:rPr>
+              <w:t>0.059</w:t>
+            </w:r>
+          </w:p>
+        </w:tc>
+        <w:tc>
+          <w:tcPr>
+            <w:tcW w:type="dxa" w:w="1440"/>
+          </w:tcPr>
+          <w:p>
+            <w:r>
+              <w:rPr>
+                <w:b/>
+              </w:rPr>
+              <w:t>0.066</w:t>
+            </w:r>
+          </w:p>
+        </w:tc>
+        <w:tc>
+          <w:tcPr>
+            <w:tcW w:type="dxa" w:w="1440"/>
+          </w:tcPr>
+          <w:p>
+            <w:r>
+              <w:rPr>
+                <w:b/>
+              </w:rPr>
+              <w:t>0.0000</w:t>
+            </w:r>
+          </w:p>
+        </w:tc>
+        <w:tc>
+          <w:tcPr>
+            <w:tcW w:type="dxa" w:w="1440"/>
+          </w:tcPr>
+          <w:p>
+            <w:r>
+              <w:t>***</w:t>
+            </w:r>
+          </w:p>
+        </w:tc>
+      </w:tr>
+      <w:tr>
+        <w:tc>
+          <w:tcPr>
+            <w:tcW w:type="dxa" w:w="1440"/>
+          </w:tcPr>
+          <w:p>
+            <w:r>
+              <w:rPr>
+                <w:b/>
+              </w:rPr>
+              <w:t>age_group_30-34</w:t>
+            </w:r>
+          </w:p>
+        </w:tc>
+        <w:tc>
+          <w:tcPr>
+            <w:tcW w:type="dxa" w:w="1440"/>
+          </w:tcPr>
+          <w:p>
+            <w:r>
+              <w:rPr>
+                <w:b/>
+                <w:color w:val="0066CC"/>
+              </w:rPr>
+              <w:t>0.026</w:t>
+            </w:r>
+          </w:p>
+        </w:tc>
+        <w:tc>
+          <w:tcPr>
+            <w:tcW w:type="dxa" w:w="1440"/>
+          </w:tcPr>
+          <w:p>
+            <w:r>
+              <w:rPr>
+                <w:b/>
+              </w:rPr>
+              <w:t>0.024</w:t>
+            </w:r>
+          </w:p>
+        </w:tc>
+        <w:tc>
+          <w:tcPr>
+            <w:tcW w:type="dxa" w:w="1440"/>
+          </w:tcPr>
+          <w:p>
+            <w:r>
+              <w:rPr>
+                <w:b/>
+              </w:rPr>
+              <w:t>0.027</w:t>
+            </w:r>
+          </w:p>
+        </w:tc>
+        <w:tc>
+          <w:tcPr>
+            <w:tcW w:type="dxa" w:w="1440"/>
+          </w:tcPr>
+          <w:p>
+            <w:r>
+              <w:rPr>
+                <w:b/>
+              </w:rPr>
+              <w:t>0.0000</w:t>
+            </w:r>
+          </w:p>
+        </w:tc>
+        <w:tc>
+          <w:tcPr>
+            <w:tcW w:type="dxa" w:w="1440"/>
+          </w:tcPr>
+          <w:p>
+            <w:r>
+              <w:t>***</w:t>
+            </w:r>
+          </w:p>
+        </w:tc>
+      </w:tr>
+      <w:tr>
+        <w:tc>
+          <w:tcPr>
+            <w:tcW w:type="dxa" w:w="1440"/>
+          </w:tcPr>
+          <w:p>
+            <w:r>
+              <w:rPr>
+                <w:b/>
+              </w:rPr>
+              <w:t>age_group_35+</w:t>
+            </w:r>
+          </w:p>
+        </w:tc>
+        <w:tc>
+          <w:tcPr>
+            <w:tcW w:type="dxa" w:w="1440"/>
+          </w:tcPr>
+          <w:p>
+            <w:r>
+              <w:rPr>
+                <w:b/>
+                <w:color w:val="0066CC"/>
+              </w:rPr>
+              <w:t>0.015</w:t>
+            </w:r>
+          </w:p>
+        </w:tc>
+        <w:tc>
+          <w:tcPr>
+            <w:tcW w:type="dxa" w:w="1440"/>
+          </w:tcPr>
+          <w:p>
+            <w:r>
+              <w:rPr>
+                <w:b/>
+              </w:rPr>
+              <w:t>0.014</w:t>
+            </w:r>
+          </w:p>
+        </w:tc>
+        <w:tc>
+          <w:tcPr>
+            <w:tcW w:type="dxa" w:w="1440"/>
+          </w:tcPr>
+          <w:p>
+            <w:r>
+              <w:rPr>
+                <w:b/>
+              </w:rPr>
+              <w:t>0.016</w:t>
+            </w:r>
+          </w:p>
+        </w:tc>
+        <w:tc>
+          <w:tcPr>
+            <w:tcW w:type="dxa" w:w="1440"/>
+          </w:tcPr>
+          <w:p>
+            <w:r>
+              <w:rPr>
+                <w:b/>
+              </w:rPr>
+              <w:t>0.0000</w:t>
+            </w:r>
+          </w:p>
+        </w:tc>
+        <w:tc>
+          <w:tcPr>
+            <w:tcW w:type="dxa" w:w="1440"/>
+          </w:tcPr>
+          <w:p>
+            <w:r>
+              <w:t>***</w:t>
+            </w:r>
+          </w:p>
+        </w:tc>
+      </w:tr>
+      <w:tr>
+        <w:tc>
+          <w:tcPr>
+            <w:tcW w:type="dxa" w:w="1440"/>
+          </w:tcPr>
+          <w:p>
+            <w:r>
+              <w:rPr>
+                <w:b/>
+              </w:rPr>
+              <w:t>marital_status_Unmarried</w:t>
+            </w:r>
+          </w:p>
+        </w:tc>
+        <w:tc>
+          <w:tcPr>
+            <w:tcW w:type="dxa" w:w="1440"/>
+          </w:tcPr>
+          <w:p>
+            <w:r>
+              <w:rPr>
+                <w:b/>
+                <w:color w:val="CC6600"/>
+              </w:rPr>
+              <w:t>1.239</w:t>
+            </w:r>
+          </w:p>
+        </w:tc>
+        <w:tc>
+          <w:tcPr>
+            <w:tcW w:type="dxa" w:w="1440"/>
+          </w:tcPr>
+          <w:p>
+            <w:r>
+              <w:rPr>
+                <w:b/>
+              </w:rPr>
+              <w:t>1.153</w:t>
+            </w:r>
+          </w:p>
+        </w:tc>
+        <w:tc>
+          <w:tcPr>
+            <w:tcW w:type="dxa" w:w="1440"/>
+          </w:tcPr>
+          <w:p>
+            <w:r>
+              <w:rPr>
+                <w:b/>
+              </w:rPr>
+              <w:t>1.331</w:t>
+            </w:r>
+          </w:p>
+        </w:tc>
+        <w:tc>
+          <w:tcPr>
+            <w:tcW w:type="dxa" w:w="1440"/>
+          </w:tcPr>
+          <w:p>
+            <w:r>
+              <w:rPr>
+                <w:b/>
+              </w:rPr>
+              <w:t>0.0000</w:t>
+            </w:r>
+          </w:p>
+        </w:tc>
+        <w:tc>
+          <w:tcPr>
+            <w:tcW w:type="dxa" w:w="1440"/>
+          </w:tcPr>
+          <w:p>
+            <w:r>
+              <w:t>***</w:t>
+            </w:r>
+          </w:p>
+        </w:tc>
+      </w:tr>
+      <w:tr>
+        <w:tc>
+          <w:tcPr>
+            <w:tcW w:type="dxa" w:w="1440"/>
+          </w:tcPr>
+          <w:p>
+            <w:r>
+              <w:t>race_mother_Burgher</w:t>
+            </w:r>
+          </w:p>
+        </w:tc>
+        <w:tc>
+          <w:tcPr>
+            <w:tcW w:type="dxa" w:w="1440"/>
+          </w:tcPr>
+          <w:p>
+            <w:r>
+              <w:rPr>
+                <w:b/>
+                <w:color w:val="CC6600"/>
+              </w:rPr>
+              <w:t>2.163</w:t>
+            </w:r>
+          </w:p>
+        </w:tc>
+        <w:tc>
+          <w:tcPr>
+            <w:tcW w:type="dxa" w:w="1440"/>
+          </w:tcPr>
+          <w:p>
+            <w:r>
+              <w:t>0.671</w:t>
+            </w:r>
+          </w:p>
+        </w:tc>
+        <w:tc>
+          <w:tcPr>
+            <w:tcW w:type="dxa" w:w="1440"/>
+          </w:tcPr>
+          <w:p>
+            <w:r>
+              <w:t>6.975</w:t>
+            </w:r>
+          </w:p>
+        </w:tc>
+        <w:tc>
+          <w:tcPr>
+            <w:tcW w:type="dxa" w:w="1440"/>
+          </w:tcPr>
+          <w:p>
+            <w:r>
+              <w:t>0.1967</w:t>
+            </w:r>
+          </w:p>
+        </w:tc>
+        <w:tc>
+          <w:tcPr>
+            <w:tcW w:type="dxa" w:w="1440"/>
+          </w:tcPr>
+          <w:p>
+            <w:r/>
+          </w:p>
+        </w:tc>
+      </w:tr>
+      <w:tr>
+        <w:tc>
+          <w:tcPr>
+            <w:tcW w:type="dxa" w:w="1440"/>
+          </w:tcPr>
+          <w:p>
+            <w:r>
+              <w:t>race_mother_Indian Moor</w:t>
+            </w:r>
+          </w:p>
+        </w:tc>
+        <w:tc>
+          <w:tcPr>
+            <w:tcW w:type="dxa" w:w="1440"/>
+          </w:tcPr>
+          <w:p>
+            <w:r>
+              <w:rPr>
+                <w:b/>
+                <w:color w:val="CC6600"/>
+              </w:rPr>
+              <w:t>1.336</w:t>
+            </w:r>
+          </w:p>
+        </w:tc>
+        <w:tc>
+          <w:tcPr>
+            <w:tcW w:type="dxa" w:w="1440"/>
+          </w:tcPr>
+          <w:p>
+            <w:r>
+              <w:t>0.340</w:t>
+            </w:r>
+          </w:p>
+        </w:tc>
+        <w:tc>
+          <w:tcPr>
+            <w:tcW w:type="dxa" w:w="1440"/>
+          </w:tcPr>
+          <w:p>
+            <w:r>
+              <w:t>5.253</w:t>
+            </w:r>
+          </w:p>
+        </w:tc>
+        <w:tc>
+          <w:tcPr>
+            <w:tcW w:type="dxa" w:w="1440"/>
+          </w:tcPr>
+          <w:p>
+            <w:r>
+              <w:t>0.6785</w:t>
+            </w:r>
+          </w:p>
+        </w:tc>
+        <w:tc>
+          <w:tcPr>
+            <w:tcW w:type="dxa" w:w="1440"/>
+          </w:tcPr>
+          <w:p>
+            <w:r/>
+          </w:p>
+        </w:tc>
+      </w:tr>
+      <w:tr>
+        <w:tc>
+          <w:tcPr>
+            <w:tcW w:type="dxa" w:w="1440"/>
+          </w:tcPr>
+          <w:p>
+            <w:r>
+              <w:t>race_mother_Indian Tamil</w:t>
+            </w:r>
+          </w:p>
+        </w:tc>
+        <w:tc>
+          <w:tcPr>
+            <w:tcW w:type="dxa" w:w="1440"/>
+          </w:tcPr>
+          <w:p>
+            <w:r>
+              <w:rPr>
+                <w:b/>
+                <w:color w:val="CC6600"/>
+              </w:rPr>
+              <w:t>1.459</w:t>
+            </w:r>
+          </w:p>
+        </w:tc>
+        <w:tc>
+          <w:tcPr>
+            <w:tcW w:type="dxa" w:w="1440"/>
+          </w:tcPr>
+          <w:p>
+            <w:r>
+              <w:t>0.462</w:t>
+            </w:r>
+          </w:p>
+        </w:tc>
+        <w:tc>
+          <w:tcPr>
+            <w:tcW w:type="dxa" w:w="1440"/>
+          </w:tcPr>
+          <w:p>
+            <w:r>
+              <w:t>4.609</w:t>
+            </w:r>
+          </w:p>
+        </w:tc>
+        <w:tc>
+          <w:tcPr>
+            <w:tcW w:type="dxa" w:w="1440"/>
+          </w:tcPr>
+          <w:p>
+            <w:r>
+              <w:t>0.5196</w:t>
+            </w:r>
+          </w:p>
+        </w:tc>
+        <w:tc>
+          <w:tcPr>
+            <w:tcW w:type="dxa" w:w="1440"/>
+          </w:tcPr>
+          <w:p>
+            <w:r/>
+          </w:p>
+        </w:tc>
+      </w:tr>
+      <w:tr>
+        <w:tc>
+          <w:tcPr>
+            <w:tcW w:type="dxa" w:w="1440"/>
+          </w:tcPr>
+          <w:p>
+            <w:r>
+              <w:t>race_mother_Malay</w:t>
+            </w:r>
+          </w:p>
+        </w:tc>
+        <w:tc>
+          <w:tcPr>
+            <w:tcW w:type="dxa" w:w="1440"/>
+          </w:tcPr>
+          <w:p>
+            <w:r>
+              <w:rPr>
+                <w:b/>
+                <w:color w:val="CC6600"/>
+              </w:rPr>
+              <w:t>1.264</w:t>
+            </w:r>
+          </w:p>
+        </w:tc>
+        <w:tc>
+          <w:tcPr>
+            <w:tcW w:type="dxa" w:w="1440"/>
+          </w:tcPr>
+          <w:p>
+            <w:r>
+              <w:t>0.393</w:t>
+            </w:r>
+          </w:p>
+        </w:tc>
+        <w:tc>
+          <w:tcPr>
+            <w:tcW w:type="dxa" w:w="1440"/>
+          </w:tcPr>
+          <w:p>
+            <w:r>
+              <w:t>4.067</w:t>
+            </w:r>
+          </w:p>
+        </w:tc>
+        <w:tc>
+          <w:tcPr>
+            <w:tcW w:type="dxa" w:w="1440"/>
+          </w:tcPr>
+          <w:p>
+            <w:r>
+              <w:t>0.6944</w:t>
+            </w:r>
+          </w:p>
+        </w:tc>
+        <w:tc>
+          <w:tcPr>
+            <w:tcW w:type="dxa" w:w="1440"/>
+          </w:tcPr>
+          <w:p>
+            <w:r/>
+          </w:p>
+        </w:tc>
+      </w:tr>
+      <w:tr>
+        <w:tc>
+          <w:tcPr>
+            <w:tcW w:type="dxa" w:w="1440"/>
+          </w:tcPr>
+          <w:p>
+            <w:r>
+              <w:rPr>
+                <w:b/>
+              </w:rPr>
+              <w:t>race_mother_Other Foreigners</w:t>
+            </w:r>
+          </w:p>
+        </w:tc>
+        <w:tc>
+          <w:tcPr>
+            <w:tcW w:type="dxa" w:w="1440"/>
+          </w:tcPr>
+          <w:p>
+            <w:r>
+              <w:rPr>
+                <w:b/>
+                <w:color w:val="CC6600"/>
+              </w:rPr>
+              <w:t>3.615</w:t>
+            </w:r>
+          </w:p>
+        </w:tc>
+        <w:tc>
+          <w:tcPr>
+            <w:tcW w:type="dxa" w:w="1440"/>
+          </w:tcPr>
+          <w:p>
+            <w:r>
+              <w:rPr>
+                <w:b/>
+              </w:rPr>
+              <w:t>1.075</w:t>
+            </w:r>
+          </w:p>
+        </w:tc>
+        <w:tc>
+          <w:tcPr>
+            <w:tcW w:type="dxa" w:w="1440"/>
+          </w:tcPr>
+          <w:p>
+            <w:r>
+              <w:rPr>
+                <w:b/>
+              </w:rPr>
+              <w:t>12.153</w:t>
+            </w:r>
+          </w:p>
+        </w:tc>
+        <w:tc>
+          <w:tcPr>
+            <w:tcW w:type="dxa" w:w="1440"/>
+          </w:tcPr>
+          <w:p>
+            <w:r>
+              <w:rPr>
+                <w:b/>
+              </w:rPr>
+              <w:t>0.0378</w:t>
+            </w:r>
+          </w:p>
+        </w:tc>
+        <w:tc>
+          <w:tcPr>
+            <w:tcW w:type="dxa" w:w="1440"/>
+          </w:tcPr>
+          <w:p>
+            <w:r>
+              <w:t>*</w:t>
+            </w:r>
+          </w:p>
+        </w:tc>
+      </w:tr>
+      <w:tr>
+        <w:tc>
+          <w:tcPr>
+            <w:tcW w:type="dxa" w:w="1440"/>
+          </w:tcPr>
+          <w:p>
+            <w:r>
+              <w:t>race_mother_Other Srilankans</w:t>
+            </w:r>
+          </w:p>
+        </w:tc>
+        <w:tc>
+          <w:tcPr>
+            <w:tcW w:type="dxa" w:w="1440"/>
+          </w:tcPr>
+          <w:p>
+            <w:r>
+              <w:rPr>
+                <w:b/>
+                <w:color w:val="CC6600"/>
+              </w:rPr>
+              <w:t>2.064</w:t>
+            </w:r>
+          </w:p>
+        </w:tc>
+        <w:tc>
+          <w:tcPr>
+            <w:tcW w:type="dxa" w:w="1440"/>
+          </w:tcPr>
+          <w:p>
+            <w:r>
+              <w:t>0.548</w:t>
+            </w:r>
+          </w:p>
+        </w:tc>
+        <w:tc>
+          <w:tcPr>
+            <w:tcW w:type="dxa" w:w="1440"/>
+          </w:tcPr>
+          <w:p>
+            <w:r>
+              <w:t>7.774</w:t>
+            </w:r>
+          </w:p>
+        </w:tc>
+        <w:tc>
+          <w:tcPr>
+            <w:tcW w:type="dxa" w:w="1440"/>
+          </w:tcPr>
+          <w:p>
+            <w:r>
+              <w:t>0.2843</w:t>
+            </w:r>
+          </w:p>
+        </w:tc>
+        <w:tc>
+          <w:tcPr>
+            <w:tcW w:type="dxa" w:w="1440"/>
+          </w:tcPr>
+          <w:p>
+            <w:r/>
+          </w:p>
+        </w:tc>
+      </w:tr>
+      <w:tr>
+        <w:tc>
+          <w:tcPr>
+            <w:tcW w:type="dxa" w:w="1440"/>
+          </w:tcPr>
+          <w:p>
+            <w:r>
+              <w:t>race_mother_Pakistan Moor</w:t>
+            </w:r>
+          </w:p>
+        </w:tc>
+        <w:tc>
+          <w:tcPr>
+            <w:tcW w:type="dxa" w:w="1440"/>
+          </w:tcPr>
+          <w:p>
+            <w:r>
+              <w:rPr>
+                <w:b/>
+                <w:color w:val="CC6600"/>
+              </w:rPr>
+              <w:t>2.270</w:t>
+            </w:r>
+          </w:p>
+        </w:tc>
+        <w:tc>
+          <w:tcPr>
+            <w:tcW w:type="dxa" w:w="1440"/>
+          </w:tcPr>
+          <w:p>
+            <w:r>
+              <w:t>0.666</w:t>
+            </w:r>
+          </w:p>
+        </w:tc>
+        <w:tc>
+          <w:tcPr>
+            <w:tcW w:type="dxa" w:w="1440"/>
+          </w:tcPr>
+          <w:p>
+            <w:r>
+              <w:t>7.743</w:t>
+            </w:r>
+          </w:p>
+        </w:tc>
+        <w:tc>
+          <w:tcPr>
+            <w:tcW w:type="dxa" w:w="1440"/>
+          </w:tcPr>
+          <w:p>
+            <w:r>
+              <w:t>0.1903</w:t>
+            </w:r>
+          </w:p>
+        </w:tc>
+        <w:tc>
+          <w:tcPr>
+            <w:tcW w:type="dxa" w:w="1440"/>
+          </w:tcPr>
+          <w:p>
+            <w:r/>
+          </w:p>
+        </w:tc>
+      </w:tr>
+      <w:tr>
+        <w:tc>
+          <w:tcPr>
+            <w:tcW w:type="dxa" w:w="1440"/>
+          </w:tcPr>
+          <w:p>
+            <w:r>
+              <w:t>race_mother_Sinhalese</w:t>
+            </w:r>
+          </w:p>
+        </w:tc>
+        <w:tc>
+          <w:tcPr>
+            <w:tcW w:type="dxa" w:w="1440"/>
+          </w:tcPr>
+          <w:p>
+            <w:r>
+              <w:rPr>
+                <w:b/>
+                <w:color w:val="CC6600"/>
+              </w:rPr>
+              <w:t>2.212</w:t>
+            </w:r>
+          </w:p>
+        </w:tc>
+        <w:tc>
+          <w:tcPr>
+            <w:tcW w:type="dxa" w:w="1440"/>
+          </w:tcPr>
+          <w:p>
+            <w:r>
+              <w:t>0.701</w:t>
+            </w:r>
+          </w:p>
+        </w:tc>
+        <w:tc>
+          <w:tcPr>
+            <w:tcW w:type="dxa" w:w="1440"/>
+          </w:tcPr>
+          <w:p>
+            <w:r>
+              <w:t>6.984</w:t>
+            </w:r>
+          </w:p>
+        </w:tc>
+        <w:tc>
+          <w:tcPr>
+            <w:tcW w:type="dxa" w:w="1440"/>
+          </w:tcPr>
+          <w:p>
+            <w:r>
+              <w:t>0.1758</w:t>
+            </w:r>
+          </w:p>
+        </w:tc>
+        <w:tc>
+          <w:tcPr>
+            <w:tcW w:type="dxa" w:w="1440"/>
+          </w:tcPr>
+          <w:p>
+            <w:r/>
+          </w:p>
+        </w:tc>
+      </w:tr>
+      <w:tr>
+        <w:tc>
+          <w:tcPr>
+            <w:tcW w:type="dxa" w:w="1440"/>
+          </w:tcPr>
+          <w:p>
+            <w:r>
+              <w:t>race_mother_Srilankan Chetty</w:t>
+            </w:r>
+          </w:p>
+        </w:tc>
+        <w:tc>
+          <w:tcPr>
+            <w:tcW w:type="dxa" w:w="1440"/>
+          </w:tcPr>
+          <w:p>
+            <w:r>
+              <w:rPr>
+                <w:b/>
+                <w:color w:val="CC6600"/>
+              </w:rPr>
+              <w:t>1.196</w:t>
+            </w:r>
+          </w:p>
+        </w:tc>
+        <w:tc>
+          <w:tcPr>
+            <w:tcW w:type="dxa" w:w="1440"/>
+          </w:tcPr>
+          <w:p>
+            <w:r>
+              <w:t>0.130</w:t>
+            </w:r>
+          </w:p>
+        </w:tc>
+        <w:tc>
+          <w:tcPr>
+            <w:tcW w:type="dxa" w:w="1440"/>
+          </w:tcPr>
+          <w:p>
+            <w:r>
+              <w:t>11.002</w:t>
+            </w:r>
+          </w:p>
+        </w:tc>
+        <w:tc>
+          <w:tcPr>
+            <w:tcW w:type="dxa" w:w="1440"/>
+          </w:tcPr>
+          <w:p>
+            <w:r>
+              <w:t>0.8743</w:t>
+            </w:r>
+          </w:p>
+        </w:tc>
+        <w:tc>
+          <w:tcPr>
+            <w:tcW w:type="dxa" w:w="1440"/>
+          </w:tcPr>
+          <w:p>
+            <w:r/>
+          </w:p>
+        </w:tc>
+      </w:tr>
+      <w:tr>
+        <w:tc>
+          <w:tcPr>
+            <w:tcW w:type="dxa" w:w="1440"/>
+          </w:tcPr>
+          <w:p>
+            <w:r>
+              <w:t>race_mother_Srilankan Moor</w:t>
+            </w:r>
+          </w:p>
+        </w:tc>
+        <w:tc>
+          <w:tcPr>
+            <w:tcW w:type="dxa" w:w="1440"/>
+          </w:tcPr>
+          <w:p>
+            <w:r>
+              <w:rPr>
+                <w:b/>
+                <w:color w:val="CC6600"/>
+              </w:rPr>
+              <w:t>1.285</w:t>
+            </w:r>
+          </w:p>
+        </w:tc>
+        <w:tc>
+          <w:tcPr>
+            <w:tcW w:type="dxa" w:w="1440"/>
+          </w:tcPr>
+          <w:p>
+            <w:r>
+              <w:t>0.407</w:t>
+            </w:r>
+          </w:p>
+        </w:tc>
+        <w:tc>
+          <w:tcPr>
+            <w:tcW w:type="dxa" w:w="1440"/>
+          </w:tcPr>
+          <w:p>
+            <w:r>
+              <w:t>4.058</w:t>
+            </w:r>
+          </w:p>
+        </w:tc>
+        <w:tc>
+          <w:tcPr>
+            <w:tcW w:type="dxa" w:w="1440"/>
+          </w:tcPr>
+          <w:p>
+            <w:r>
+              <w:t>0.6688</w:t>
+            </w:r>
+          </w:p>
+        </w:tc>
+        <w:tc>
+          <w:tcPr>
+            <w:tcW w:type="dxa" w:w="1440"/>
+          </w:tcPr>
+          <w:p>
+            <w:r/>
+          </w:p>
+        </w:tc>
+      </w:tr>
+      <w:tr>
+        <w:tc>
+          <w:tcPr>
+            <w:tcW w:type="dxa" w:w="1440"/>
+          </w:tcPr>
+          <w:p>
+            <w:r>
+              <w:t>race_mother_Srilankan Tamil</w:t>
+            </w:r>
+          </w:p>
+        </w:tc>
+        <w:tc>
+          <w:tcPr>
+            <w:tcW w:type="dxa" w:w="1440"/>
+          </w:tcPr>
+          <w:p>
+            <w:r>
+              <w:rPr>
+                <w:b/>
+                <w:color w:val="CC6600"/>
+              </w:rPr>
+              <w:t>1.549</w:t>
+            </w:r>
+          </w:p>
+        </w:tc>
+        <w:tc>
+          <w:tcPr>
+            <w:tcW w:type="dxa" w:w="1440"/>
+          </w:tcPr>
+          <w:p>
+            <w:r>
+              <w:t>0.491</w:t>
+            </w:r>
+          </w:p>
+        </w:tc>
+        <w:tc>
+          <w:tcPr>
+            <w:tcW w:type="dxa" w:w="1440"/>
+          </w:tcPr>
+          <w:p>
+            <w:r>
+              <w:t>4.890</w:t>
+            </w:r>
+          </w:p>
+        </w:tc>
+        <w:tc>
+          <w:tcPr>
+            <w:tcW w:type="dxa" w:w="1440"/>
+          </w:tcPr>
+          <w:p>
+            <w:r>
+              <w:t>0.4558</w:t>
+            </w:r>
+          </w:p>
+        </w:tc>
+        <w:tc>
+          <w:tcPr>
+            <w:tcW w:type="dxa" w:w="1440"/>
+          </w:tcPr>
+          <w:p>
+            <w:r/>
+          </w:p>
+        </w:tc>
+      </w:tr>
+      <w:tr>
+        <w:tc>
+          <w:tcPr>
+            <w:tcW w:type="dxa" w:w="1440"/>
+          </w:tcPr>
+          <w:p>
+            <w:r>
+              <w:rPr>
+                <w:b/>
+              </w:rPr>
+              <w:t>Gender _Male</w:t>
+            </w:r>
+          </w:p>
+        </w:tc>
+        <w:tc>
+          <w:tcPr>
+            <w:tcW w:type="dxa" w:w="1440"/>
+          </w:tcPr>
+          <w:p>
+            <w:r>
+              <w:rPr>
+                <w:b/>
+                <w:color w:val="CC6600"/>
+              </w:rPr>
+              <w:t>1.023</w:t>
+            </w:r>
+          </w:p>
+        </w:tc>
+        <w:tc>
+          <w:tcPr>
+            <w:tcW w:type="dxa" w:w="1440"/>
+          </w:tcPr>
+          <w:p>
+            <w:r>
+              <w:rPr>
+                <w:b/>
+              </w:rPr>
+              <w:t>1.008</w:t>
+            </w:r>
+          </w:p>
+        </w:tc>
+        <w:tc>
+          <w:tcPr>
+            <w:tcW w:type="dxa" w:w="1440"/>
+          </w:tcPr>
+          <w:p>
+            <w:r>
+              <w:rPr>
+                <w:b/>
+              </w:rPr>
+              <w:t>1.040</w:t>
+            </w:r>
+          </w:p>
+        </w:tc>
+        <w:tc>
+          <w:tcPr>
+            <w:tcW w:type="dxa" w:w="1440"/>
+          </w:tcPr>
+          <w:p>
+            <w:r>
+              <w:rPr>
+                <w:b/>
+              </w:rPr>
+              <w:t>0.0038</w:t>
+            </w:r>
+          </w:p>
+        </w:tc>
+        <w:tc>
+          <w:tcPr>
+            <w:tcW w:type="dxa" w:w="1440"/>
+          </w:tcPr>
+          <w:p>
+            <w:r>
+              <w:t>**</w:t>
+            </w:r>
+          </w:p>
+        </w:tc>
+      </w:tr>
+      <w:tr>
+        <w:tc>
+          <w:tcPr>
+            <w:tcW w:type="dxa" w:w="1440"/>
+          </w:tcPr>
+          <w:p>
+            <w:r>
+              <w:rPr>
+                <w:b/>
+              </w:rPr>
+              <w:t>Hospital or Not_Not In Hospital</w:t>
+            </w:r>
+          </w:p>
+        </w:tc>
+        <w:tc>
+          <w:tcPr>
+            <w:tcW w:type="dxa" w:w="1440"/>
+          </w:tcPr>
+          <w:p>
+            <w:r>
+              <w:rPr>
+                <w:b/>
+                <w:color w:val="0066CC"/>
+              </w:rPr>
+              <w:t>0.926</w:t>
+            </w:r>
+          </w:p>
+        </w:tc>
+        <w:tc>
+          <w:tcPr>
+            <w:tcW w:type="dxa" w:w="1440"/>
+          </w:tcPr>
+          <w:p>
+            <w:r>
+              <w:rPr>
+                <w:b/>
+              </w:rPr>
+              <w:t>0.864</w:t>
+            </w:r>
+          </w:p>
+        </w:tc>
+        <w:tc>
+          <w:tcPr>
+            <w:tcW w:type="dxa" w:w="1440"/>
+          </w:tcPr>
+          <w:p>
+            <w:r>
+              <w:rPr>
+                <w:b/>
+              </w:rPr>
+              <w:t>0.991</w:t>
+            </w:r>
+          </w:p>
+        </w:tc>
+        <w:tc>
+          <w:tcPr>
+            <w:tcW w:type="dxa" w:w="1440"/>
+          </w:tcPr>
+          <w:p>
+            <w:r>
+              <w:rPr>
+                <w:b/>
+              </w:rPr>
+              <w:t>0.0274</w:t>
+            </w:r>
+          </w:p>
+        </w:tc>
+        <w:tc>
+          <w:tcPr>
+            <w:tcW w:type="dxa" w:w="1440"/>
+          </w:tcPr>
+          <w:p>
+            <w:r>
+              <w:t>*</w:t>
+            </w:r>
+          </w:p>
+        </w:tc>
+      </w:tr>
+      <w:tr>
+        <w:tc>
+          <w:tcPr>
+            <w:tcW w:type="dxa" w:w="1440"/>
+          </w:tcPr>
+          <w:p>
+            <w:r>
+              <w:t>multiple_birth_Triplets</w:t>
+            </w:r>
+          </w:p>
+        </w:tc>
+        <w:tc>
+          <w:tcPr>
+            <w:tcW w:type="dxa" w:w="1440"/>
+          </w:tcPr>
+          <w:p>
+            <w:r>
+              <w:rPr>
+                <w:b/>
+                <w:color w:val="0066CC"/>
+              </w:rPr>
+              <w:t>0.864</w:t>
+            </w:r>
+          </w:p>
+        </w:tc>
+        <w:tc>
+          <w:tcPr>
+            <w:tcW w:type="dxa" w:w="1440"/>
+          </w:tcPr>
+          <w:p>
+            <w:r>
+              <w:t>0.431</w:t>
+            </w:r>
+          </w:p>
+        </w:tc>
+        <w:tc>
+          <w:tcPr>
+            <w:tcW w:type="dxa" w:w="1440"/>
+          </w:tcPr>
+          <w:p>
+            <w:r>
+              <w:t>1.732</w:t>
+            </w:r>
+          </w:p>
+        </w:tc>
+        <w:tc>
+          <w:tcPr>
+            <w:tcW w:type="dxa" w:w="1440"/>
+          </w:tcPr>
+          <w:p>
+            <w:r>
+              <w:t>0.6803</w:t>
+            </w:r>
+          </w:p>
+        </w:tc>
+        <w:tc>
+          <w:tcPr>
+            <w:tcW w:type="dxa" w:w="1440"/>
+          </w:tcPr>
+          <w:p>
+            <w:r/>
+          </w:p>
+        </w:tc>
+      </w:tr>
+      <w:tr>
+        <w:tc>
+          <w:tcPr>
+            <w:tcW w:type="dxa" w:w="1440"/>
+          </w:tcPr>
+          <w:p>
+            <w:r>
+              <w:rPr>
+                <w:b/>
+              </w:rPr>
+              <w:t>Birth_Weight(grams)</w:t>
+            </w:r>
+          </w:p>
+        </w:tc>
+        <w:tc>
+          <w:tcPr>
+            <w:tcW w:type="dxa" w:w="1440"/>
+          </w:tcPr>
+          <w:p>
+            <w:r>
+              <w:t>1.000</w:t>
+            </w:r>
+          </w:p>
+        </w:tc>
+        <w:tc>
+          <w:tcPr>
+            <w:tcW w:type="dxa" w:w="1440"/>
+          </w:tcPr>
+          <w:p>
+            <w:r>
+              <w:rPr>
+                <w:b/>
+              </w:rPr>
+              <w:t>1.000</w:t>
+            </w:r>
+          </w:p>
+        </w:tc>
+        <w:tc>
+          <w:tcPr>
+            <w:tcW w:type="dxa" w:w="1440"/>
+          </w:tcPr>
+          <w:p>
+            <w:r>
+              <w:rPr>
+                <w:b/>
+              </w:rPr>
+              <w:t>1.000</w:t>
+            </w:r>
+          </w:p>
+        </w:tc>
+        <w:tc>
+          <w:tcPr>
+            <w:tcW w:type="dxa" w:w="1440"/>
+          </w:tcPr>
+          <w:p>
+            <w:r>
+              <w:rPr>
+                <w:b/>
+              </w:rPr>
+              <w:t>0.0000</w:t>
+            </w:r>
+          </w:p>
+        </w:tc>
+        <w:tc>
+          <w:tcPr>
+            <w:tcW w:type="dxa" w:w="1440"/>
+          </w:tcPr>
+          <w:p>
+            <w:r>
+              <w:t>***</w:t>
+            </w:r>
+          </w:p>
+        </w:tc>
+      </w:tr>
+    </w:tbl>
     <w:p>
       <w:r>
-        <w:t>• Predictors with OR &gt; 1 (positive association - higher odds of first-born): 3</w:t>
-        <w:br/>
+        <w:rPr>
+          <w:sz w:val="18"/>
+        </w:rPr>
+        <w:t xml:space="preserve">Significance codes: </w:t>
       </w:r>
       <w:r>
-        <w:t xml:space="preserve">  - marital_status_Unmarried: OR = 1.24 (95% CI: 1.15-1.33)</w:t>
-        <w:br/>
+        <w:rPr>
+          <w:sz w:val="18"/>
+        </w:rPr>
+        <w:t xml:space="preserve">*** p&lt;0.001, </w:t>
       </w:r>
       <w:r>
-        <w:t xml:space="preserve">  - race_mother_Other Foreigners: OR = 3.62 (95% CI: 1.07-12.15)</w:t>
-        <w:br/>
+        <w:rPr>
+          <w:sz w:val="18"/>
+        </w:rPr>
+        <w:t xml:space="preserve">** p&lt;0.01, </w:t>
       </w:r>
       <w:r>
-        <w:t xml:space="preserve">  - Gender _Male: OR = 1.02 (95% CI: 1.01-1.04)</w:t>
-        <w:br/>
-      </w:r>
-      <w:r>
-        <w:t>• Predictors with OR &lt; 1 (negative association - lower odds of first-born): 5</w:t>
-        <w:br/>
-      </w:r>
-      <w:r>
-        <w:t xml:space="preserve">  - age_group_20-24: OR = 0.18 (95% CI: 0.17-0.19)</w:t>
-        <w:br/>
-      </w:r>
-      <w:r>
-        <w:t xml:space="preserve">  - age_group_25-29: OR = 0.06 (95% CI: 0.06-0.07)</w:t>
-        <w:br/>
-      </w:r>
-      <w:r>
-        <w:t xml:space="preserve">  - age_group_30-34: OR = 0.03 (95% CI: 0.02-0.03)</w:t>
-        <w:br/>
-      </w:r>
-      <w:r>
-        <w:t xml:space="preserve">  - age_group_35+: OR = 0.01 (95% CI: 0.01-0.02)</w:t>
-        <w:br/>
-      </w:r>
-      <w:r>
-        <w:t xml:space="preserve">  - Hospital or Not_Not In Hospital: OR = 0.93 (95% CI: 0.86-0.99)</w:t>
-        <w:br/>
-      </w:r>
-      <w:r>
-        <w:t>• Predictors crossing OR = 1 (not statistically significant): 12</w:t>
-        <w:br/>
+        <w:rPr>
+          <w:sz w:val="18"/>
+        </w:rPr>
+        <w:t>* p&lt;0.05</w:t>
       </w:r>
     </w:p>
     <w:p>
@@ -7896,58 +9409,467 @@
         <w:pStyle w:val="Heading2"/>
       </w:pPr>
       <w:r>
-        <w:t>Forest Plot</w:t>
+        <w:t>Summary of Odds Ratios Analysis</w:t>
       </w:r>
     </w:p>
+    <w:tbl>
+      <w:tblPr>
+        <w:tblStyle w:val="LightShading"/>
+        <w:tblW w:type="auto" w:w="0"/>
+        <w:tblLayout w:type="fixed"/>
+        <w:tblLook w:firstColumn="1" w:firstRow="1" w:lastColumn="0" w:lastRow="0" w:noHBand="0" w:noVBand="1" w:val="04A0"/>
+      </w:tblPr>
+      <w:tblGrid>
+        <w:gridCol w:w="4320"/>
+        <w:gridCol w:w="3600"/>
+      </w:tblGrid>
+      <w:tr>
+        <w:tc>
+          <w:tcPr>
+            <w:tcW w:type="dxa" w:w="4320"/>
+          </w:tcPr>
+          <w:p>
+            <w:r>
+              <w:rPr>
+                <w:b/>
+              </w:rPr>
+              <w:t>Metric</w:t>
+            </w:r>
+          </w:p>
+        </w:tc>
+        <w:tc>
+          <w:tcPr>
+            <w:tcW w:type="dxa" w:w="4320"/>
+          </w:tcPr>
+          <w:p>
+            <w:r>
+              <w:rPr>
+                <w:b/>
+              </w:rPr>
+              <w:t>Count</w:t>
+            </w:r>
+          </w:p>
+        </w:tc>
+      </w:tr>
+      <w:tr>
+        <w:tc>
+          <w:tcPr>
+            <w:tcW w:type="dxa" w:w="4320"/>
+          </w:tcPr>
+          <w:p>
+            <w:r>
+              <w:t>Total Predictors Analyzed</w:t>
+            </w:r>
+          </w:p>
+        </w:tc>
+        <w:tc>
+          <w:tcPr>
+            <w:tcW w:type="dxa" w:w="4320"/>
+          </w:tcPr>
+          <w:p>
+            <w:r>
+              <w:t>20</w:t>
+            </w:r>
+          </w:p>
+        </w:tc>
+      </w:tr>
+      <w:tr>
+        <w:tc>
+          <w:tcPr>
+            <w:tcW w:type="dxa" w:w="4320"/>
+          </w:tcPr>
+          <w:p>
+            <w:r>
+              <w:t>Significant Predictors (p &lt; 0.05)</w:t>
+            </w:r>
+          </w:p>
+        </w:tc>
+        <w:tc>
+          <w:tcPr>
+            <w:tcW w:type="dxa" w:w="4320"/>
+          </w:tcPr>
+          <w:p>
+            <w:r>
+              <w:t>9</w:t>
+            </w:r>
+          </w:p>
+        </w:tc>
+      </w:tr>
+      <w:tr>
+        <w:tc>
+          <w:tcPr>
+            <w:tcW w:type="dxa" w:w="4320"/>
+          </w:tcPr>
+          <w:p>
+            <w:r>
+              <w:t>Positive Associations (OR &gt; 1)</w:t>
+            </w:r>
+          </w:p>
+        </w:tc>
+        <w:tc>
+          <w:tcPr>
+            <w:tcW w:type="dxa" w:w="4320"/>
+          </w:tcPr>
+          <w:p>
+            <w:r>
+              <w:t>13 (higher odds of first-born)</w:t>
+            </w:r>
+          </w:p>
+        </w:tc>
+      </w:tr>
+      <w:tr>
+        <w:tc>
+          <w:tcPr>
+            <w:tcW w:type="dxa" w:w="4320"/>
+          </w:tcPr>
+          <w:p>
+            <w:r>
+              <w:t>Negative Associations (OR &lt; 1)</w:t>
+            </w:r>
+          </w:p>
+        </w:tc>
+        <w:tc>
+          <w:tcPr>
+            <w:tcW w:type="dxa" w:w="4320"/>
+          </w:tcPr>
+          <w:p>
+            <w:r>
+              <w:t>6 (lower odds of first-born)</w:t>
+            </w:r>
+          </w:p>
+        </w:tc>
+      </w:tr>
+      <w:tr>
+        <w:tc>
+          <w:tcPr>
+            <w:tcW w:type="dxa" w:w="4320"/>
+          </w:tcPr>
+          <w:p>
+            <w:r>
+              <w:t>Neutral Associations (OR = 1)</w:t>
+            </w:r>
+          </w:p>
+        </w:tc>
+        <w:tc>
+          <w:tcPr>
+            <w:tcW w:type="dxa" w:w="4320"/>
+          </w:tcPr>
+          <w:p>
+            <w:r>
+              <w:t>1</w:t>
+            </w:r>
+          </w:p>
+        </w:tc>
+      </w:tr>
+    </w:tbl>
     <w:p>
       <w:pPr>
-        <w:jc w:val="center"/>
+        <w:pStyle w:val="Heading2"/>
       </w:pPr>
       <w:r>
-        <w:drawing>
-          <wp:inline xmlns:a="http://schemas.openxmlformats.org/drawingml/2006/main" xmlns:pic="http://schemas.openxmlformats.org/drawingml/2006/picture">
-            <wp:extent cx="5943600" cy="6612437"/>
-            <wp:docPr id="1" name="Picture 1"/>
-            <wp:cNvGraphicFramePr>
-              <a:graphicFrameLocks noChangeAspect="1"/>
-            </wp:cNvGraphicFramePr>
-            <a:graphic>
-              <a:graphicData uri="http://schemas.openxmlformats.org/drawingml/2006/picture">
-                <pic:pic>
-                  <pic:nvPicPr>
-                    <pic:cNvPr id="0" name="fig7_binary_forest_hd.png"/>
-                    <pic:cNvPicPr/>
-                  </pic:nvPicPr>
-                  <pic:blipFill>
-                    <a:blip r:embed="rId9"/>
-                    <a:stretch>
-                      <a:fillRect/>
-                    </a:stretch>
-                  </pic:blipFill>
-                  <pic:spPr>
-                    <a:xfrm>
-                      <a:off x="0" y="0"/>
-                      <a:ext cx="5943600" cy="6612437"/>
-                    </a:xfrm>
-                    <a:prstGeom prst="rect"/>
-                  </pic:spPr>
-                </pic:pic>
-              </a:graphicData>
-            </a:graphic>
-          </wp:inline>
-        </w:drawing>
+        <w:t>Top 5 Positive Associations (Higher Odds of First-born)</w:t>
       </w:r>
     </w:p>
+    <w:tbl>
+      <w:tblPr>
+        <w:tblStyle w:val="LightShading"/>
+        <w:tblW w:type="auto" w:w="0"/>
+        <w:tblLook w:firstColumn="1" w:firstRow="1" w:lastColumn="0" w:lastRow="0" w:noHBand="0" w:noVBand="1" w:val="04A0"/>
+      </w:tblPr>
+      <w:tblGrid>
+        <w:gridCol w:w="2160"/>
+        <w:gridCol w:w="2160"/>
+        <w:gridCol w:w="2160"/>
+        <w:gridCol w:w="2160"/>
+      </w:tblGrid>
+      <w:tr>
+        <w:tc>
+          <w:tcPr>
+            <w:tcW w:type="dxa" w:w="2160"/>
+          </w:tcPr>
+          <w:p>
+            <w:r>
+              <w:rPr>
+                <w:b/>
+              </w:rPr>
+              <w:t>Predictor</w:t>
+            </w:r>
+          </w:p>
+        </w:tc>
+        <w:tc>
+          <w:tcPr>
+            <w:tcW w:type="dxa" w:w="2160"/>
+          </w:tcPr>
+          <w:p>
+            <w:r>
+              <w:rPr>
+                <w:b/>
+              </w:rPr>
+              <w:t>Odds Ratio</w:t>
+            </w:r>
+          </w:p>
+        </w:tc>
+        <w:tc>
+          <w:tcPr>
+            <w:tcW w:type="dxa" w:w="2160"/>
+          </w:tcPr>
+          <w:p>
+            <w:r>
+              <w:rPr>
+                <w:b/>
+              </w:rPr>
+              <w:t>95% CI</w:t>
+            </w:r>
+          </w:p>
+        </w:tc>
+        <w:tc>
+          <w:tcPr>
+            <w:tcW w:type="dxa" w:w="2160"/>
+          </w:tcPr>
+          <w:p>
+            <w:r>
+              <w:rPr>
+                <w:b/>
+              </w:rPr>
+              <w:t>Effect</w:t>
+            </w:r>
+          </w:p>
+        </w:tc>
+      </w:tr>
+      <w:tr>
+        <w:tc>
+          <w:tcPr>
+            <w:tcW w:type="dxa" w:w="2160"/>
+          </w:tcPr>
+          <w:p>
+            <w:r>
+              <w:t>race_mother_Other Foreigners</w:t>
+            </w:r>
+          </w:p>
+        </w:tc>
+        <w:tc>
+          <w:tcPr>
+            <w:tcW w:type="dxa" w:w="2160"/>
+          </w:tcPr>
+          <w:p>
+            <w:r>
+              <w:rPr>
+                <w:b/>
+                <w:color w:val="CC6600"/>
+              </w:rPr>
+              <w:t>3.615</w:t>
+            </w:r>
+          </w:p>
+        </w:tc>
+        <w:tc>
+          <w:tcPr>
+            <w:tcW w:type="dxa" w:w="2160"/>
+          </w:tcPr>
+          <w:p>
+            <w:r>
+              <w:t>(1.075-12.153)</w:t>
+            </w:r>
+          </w:p>
+        </w:tc>
+        <w:tc>
+          <w:tcPr>
+            <w:tcW w:type="dxa" w:w="2160"/>
+          </w:tcPr>
+          <w:p>
+            <w:r>
+              <w:t>261.5% increase</w:t>
+            </w:r>
+          </w:p>
+        </w:tc>
+      </w:tr>
+      <w:tr>
+        <w:tc>
+          <w:tcPr>
+            <w:tcW w:type="dxa" w:w="2160"/>
+          </w:tcPr>
+          <w:p>
+            <w:r>
+              <w:t>race_mother_Pakistan Moor</w:t>
+            </w:r>
+          </w:p>
+        </w:tc>
+        <w:tc>
+          <w:tcPr>
+            <w:tcW w:type="dxa" w:w="2160"/>
+          </w:tcPr>
+          <w:p>
+            <w:r>
+              <w:rPr>
+                <w:b/>
+                <w:color w:val="CC6600"/>
+              </w:rPr>
+              <w:t>2.270</w:t>
+            </w:r>
+          </w:p>
+        </w:tc>
+        <w:tc>
+          <w:tcPr>
+            <w:tcW w:type="dxa" w:w="2160"/>
+          </w:tcPr>
+          <w:p>
+            <w:r>
+              <w:t>(0.666-7.743)</w:t>
+            </w:r>
+          </w:p>
+        </w:tc>
+        <w:tc>
+          <w:tcPr>
+            <w:tcW w:type="dxa" w:w="2160"/>
+          </w:tcPr>
+          <w:p>
+            <w:r>
+              <w:t>127.0% increase</w:t>
+            </w:r>
+          </w:p>
+        </w:tc>
+      </w:tr>
+      <w:tr>
+        <w:tc>
+          <w:tcPr>
+            <w:tcW w:type="dxa" w:w="2160"/>
+          </w:tcPr>
+          <w:p>
+            <w:r>
+              <w:t>race_mother_Sinhalese</w:t>
+            </w:r>
+          </w:p>
+        </w:tc>
+        <w:tc>
+          <w:tcPr>
+            <w:tcW w:type="dxa" w:w="2160"/>
+          </w:tcPr>
+          <w:p>
+            <w:r>
+              <w:rPr>
+                <w:b/>
+                <w:color w:val="CC6600"/>
+              </w:rPr>
+              <w:t>2.212</w:t>
+            </w:r>
+          </w:p>
+        </w:tc>
+        <w:tc>
+          <w:tcPr>
+            <w:tcW w:type="dxa" w:w="2160"/>
+          </w:tcPr>
+          <w:p>
+            <w:r>
+              <w:t>(0.701-6.984)</w:t>
+            </w:r>
+          </w:p>
+        </w:tc>
+        <w:tc>
+          <w:tcPr>
+            <w:tcW w:type="dxa" w:w="2160"/>
+          </w:tcPr>
+          <w:p>
+            <w:r>
+              <w:t>121.2% increase</w:t>
+            </w:r>
+          </w:p>
+        </w:tc>
+      </w:tr>
+      <w:tr>
+        <w:tc>
+          <w:tcPr>
+            <w:tcW w:type="dxa" w:w="2160"/>
+          </w:tcPr>
+          <w:p>
+            <w:r>
+              <w:t>race_mother_Burgher</w:t>
+            </w:r>
+          </w:p>
+        </w:tc>
+        <w:tc>
+          <w:tcPr>
+            <w:tcW w:type="dxa" w:w="2160"/>
+          </w:tcPr>
+          <w:p>
+            <w:r>
+              <w:rPr>
+                <w:b/>
+                <w:color w:val="CC6600"/>
+              </w:rPr>
+              <w:t>2.163</w:t>
+            </w:r>
+          </w:p>
+        </w:tc>
+        <w:tc>
+          <w:tcPr>
+            <w:tcW w:type="dxa" w:w="2160"/>
+          </w:tcPr>
+          <w:p>
+            <w:r>
+              <w:t>(0.671-6.975)</w:t>
+            </w:r>
+          </w:p>
+        </w:tc>
+        <w:tc>
+          <w:tcPr>
+            <w:tcW w:type="dxa" w:w="2160"/>
+          </w:tcPr>
+          <w:p>
+            <w:r>
+              <w:t>116.3% increase</w:t>
+            </w:r>
+          </w:p>
+        </w:tc>
+      </w:tr>
+      <w:tr>
+        <w:tc>
+          <w:tcPr>
+            <w:tcW w:type="dxa" w:w="2160"/>
+          </w:tcPr>
+          <w:p>
+            <w:r>
+              <w:t>race_mother_Other Srilankans</w:t>
+            </w:r>
+          </w:p>
+        </w:tc>
+        <w:tc>
+          <w:tcPr>
+            <w:tcW w:type="dxa" w:w="2160"/>
+          </w:tcPr>
+          <w:p>
+            <w:r>
+              <w:rPr>
+                <w:b/>
+                <w:color w:val="CC6600"/>
+              </w:rPr>
+              <w:t>2.064</w:t>
+            </w:r>
+          </w:p>
+        </w:tc>
+        <w:tc>
+          <w:tcPr>
+            <w:tcW w:type="dxa" w:w="2160"/>
+          </w:tcPr>
+          <w:p>
+            <w:r>
+              <w:t>(0.548-7.774)</w:t>
+            </w:r>
+          </w:p>
+        </w:tc>
+        <w:tc>
+          <w:tcPr>
+            <w:tcW w:type="dxa" w:w="2160"/>
+          </w:tcPr>
+          <w:p>
+            <w:r>
+              <w:t>106.4% increase</w:t>
+            </w:r>
+          </w:p>
+        </w:tc>
+      </w:tr>
+    </w:tbl>
     <w:p>
-      <w:pPr>
-        <w:jc w:val="center"/>
-      </w:pPr>
       <w:r>
-        <w:rPr>
-          <w:i/>
-          <w:sz w:val="18"/>
-        </w:rPr>
-        <w:t>Figure 7.1: Forest plot of odds ratios for Model 3 (Binary Logistic Regression)</w:t>
+        <w:t>Note: These factors increase the odds of being first-born. For example, an OR of 2.00 means the odds are 100% higher (doubled).</w:t>
       </w:r>
     </w:p>
     <w:p>
@@ -7955,7 +9877,317 @@
         <w:pStyle w:val="Heading2"/>
       </w:pPr>
       <w:r>
-        <w:t>Key Predictors by Effect Size</w:t>
+        <w:t>Top 5 Negative Associations (Lower Odds of First-born)</w:t>
+      </w:r>
+    </w:p>
+    <w:tbl>
+      <w:tblPr>
+        <w:tblStyle w:val="LightShading"/>
+        <w:tblW w:type="auto" w:w="0"/>
+        <w:tblLook w:firstColumn="1" w:firstRow="1" w:lastColumn="0" w:lastRow="0" w:noHBand="0" w:noVBand="1" w:val="04A0"/>
+      </w:tblPr>
+      <w:tblGrid>
+        <w:gridCol w:w="2160"/>
+        <w:gridCol w:w="2160"/>
+        <w:gridCol w:w="2160"/>
+        <w:gridCol w:w="2160"/>
+      </w:tblGrid>
+      <w:tr>
+        <w:tc>
+          <w:tcPr>
+            <w:tcW w:type="dxa" w:w="2160"/>
+          </w:tcPr>
+          <w:p>
+            <w:r>
+              <w:rPr>
+                <w:b/>
+              </w:rPr>
+              <w:t>Predictor</w:t>
+            </w:r>
+          </w:p>
+        </w:tc>
+        <w:tc>
+          <w:tcPr>
+            <w:tcW w:type="dxa" w:w="2160"/>
+          </w:tcPr>
+          <w:p>
+            <w:r>
+              <w:rPr>
+                <w:b/>
+              </w:rPr>
+              <w:t>Odds Ratio</w:t>
+            </w:r>
+          </w:p>
+        </w:tc>
+        <w:tc>
+          <w:tcPr>
+            <w:tcW w:type="dxa" w:w="2160"/>
+          </w:tcPr>
+          <w:p>
+            <w:r>
+              <w:rPr>
+                <w:b/>
+              </w:rPr>
+              <w:t>95% CI</w:t>
+            </w:r>
+          </w:p>
+        </w:tc>
+        <w:tc>
+          <w:tcPr>
+            <w:tcW w:type="dxa" w:w="2160"/>
+          </w:tcPr>
+          <w:p>
+            <w:r>
+              <w:rPr>
+                <w:b/>
+              </w:rPr>
+              <w:t>Effect</w:t>
+            </w:r>
+          </w:p>
+        </w:tc>
+      </w:tr>
+      <w:tr>
+        <w:tc>
+          <w:tcPr>
+            <w:tcW w:type="dxa" w:w="2160"/>
+          </w:tcPr>
+          <w:p>
+            <w:r>
+              <w:t>age_group_35+</w:t>
+            </w:r>
+          </w:p>
+        </w:tc>
+        <w:tc>
+          <w:tcPr>
+            <w:tcW w:type="dxa" w:w="2160"/>
+          </w:tcPr>
+          <w:p>
+            <w:r>
+              <w:rPr>
+                <w:b/>
+                <w:color w:val="0066CC"/>
+              </w:rPr>
+              <w:t>0.015</w:t>
+            </w:r>
+          </w:p>
+        </w:tc>
+        <w:tc>
+          <w:tcPr>
+            <w:tcW w:type="dxa" w:w="2160"/>
+          </w:tcPr>
+          <w:p>
+            <w:r>
+              <w:t>(0.014-0.016)</w:t>
+            </w:r>
+          </w:p>
+        </w:tc>
+        <w:tc>
+          <w:tcPr>
+            <w:tcW w:type="dxa" w:w="2160"/>
+          </w:tcPr>
+          <w:p>
+            <w:r>
+              <w:t>98.5% decrease</w:t>
+            </w:r>
+          </w:p>
+        </w:tc>
+      </w:tr>
+      <w:tr>
+        <w:tc>
+          <w:tcPr>
+            <w:tcW w:type="dxa" w:w="2160"/>
+          </w:tcPr>
+          <w:p>
+            <w:r>
+              <w:t>age_group_30-34</w:t>
+            </w:r>
+          </w:p>
+        </w:tc>
+        <w:tc>
+          <w:tcPr>
+            <w:tcW w:type="dxa" w:w="2160"/>
+          </w:tcPr>
+          <w:p>
+            <w:r>
+              <w:rPr>
+                <w:b/>
+                <w:color w:val="0066CC"/>
+              </w:rPr>
+              <w:t>0.026</w:t>
+            </w:r>
+          </w:p>
+        </w:tc>
+        <w:tc>
+          <w:tcPr>
+            <w:tcW w:type="dxa" w:w="2160"/>
+          </w:tcPr>
+          <w:p>
+            <w:r>
+              <w:t>(0.024-0.027)</w:t>
+            </w:r>
+          </w:p>
+        </w:tc>
+        <w:tc>
+          <w:tcPr>
+            <w:tcW w:type="dxa" w:w="2160"/>
+          </w:tcPr>
+          <w:p>
+            <w:r>
+              <w:t>97.4% decrease</w:t>
+            </w:r>
+          </w:p>
+        </w:tc>
+      </w:tr>
+      <w:tr>
+        <w:tc>
+          <w:tcPr>
+            <w:tcW w:type="dxa" w:w="2160"/>
+          </w:tcPr>
+          <w:p>
+            <w:r>
+              <w:t>age_group_25-29</w:t>
+            </w:r>
+          </w:p>
+        </w:tc>
+        <w:tc>
+          <w:tcPr>
+            <w:tcW w:type="dxa" w:w="2160"/>
+          </w:tcPr>
+          <w:p>
+            <w:r>
+              <w:rPr>
+                <w:b/>
+                <w:color w:val="0066CC"/>
+              </w:rPr>
+              <w:t>0.062</w:t>
+            </w:r>
+          </w:p>
+        </w:tc>
+        <w:tc>
+          <w:tcPr>
+            <w:tcW w:type="dxa" w:w="2160"/>
+          </w:tcPr>
+          <w:p>
+            <w:r>
+              <w:t>(0.059-0.066)</w:t>
+            </w:r>
+          </w:p>
+        </w:tc>
+        <w:tc>
+          <w:tcPr>
+            <w:tcW w:type="dxa" w:w="2160"/>
+          </w:tcPr>
+          <w:p>
+            <w:r>
+              <w:t>93.8% decrease</w:t>
+            </w:r>
+          </w:p>
+        </w:tc>
+      </w:tr>
+      <w:tr>
+        <w:tc>
+          <w:tcPr>
+            <w:tcW w:type="dxa" w:w="2160"/>
+          </w:tcPr>
+          <w:p>
+            <w:r>
+              <w:t>age_group_20-24</w:t>
+            </w:r>
+          </w:p>
+        </w:tc>
+        <w:tc>
+          <w:tcPr>
+            <w:tcW w:type="dxa" w:w="2160"/>
+          </w:tcPr>
+          <w:p>
+            <w:r>
+              <w:rPr>
+                <w:b/>
+                <w:color w:val="0066CC"/>
+              </w:rPr>
+              <w:t>0.182</w:t>
+            </w:r>
+          </w:p>
+        </w:tc>
+        <w:tc>
+          <w:tcPr>
+            <w:tcW w:type="dxa" w:w="2160"/>
+          </w:tcPr>
+          <w:p>
+            <w:r>
+              <w:t>(0.171-0.193)</w:t>
+            </w:r>
+          </w:p>
+        </w:tc>
+        <w:tc>
+          <w:tcPr>
+            <w:tcW w:type="dxa" w:w="2160"/>
+          </w:tcPr>
+          <w:p>
+            <w:r>
+              <w:t>81.8% decrease</w:t>
+            </w:r>
+          </w:p>
+        </w:tc>
+      </w:tr>
+      <w:tr>
+        <w:tc>
+          <w:tcPr>
+            <w:tcW w:type="dxa" w:w="2160"/>
+          </w:tcPr>
+          <w:p>
+            <w:r>
+              <w:t>multiple_birth_Triplets</w:t>
+            </w:r>
+          </w:p>
+        </w:tc>
+        <w:tc>
+          <w:tcPr>
+            <w:tcW w:type="dxa" w:w="2160"/>
+          </w:tcPr>
+          <w:p>
+            <w:r>
+              <w:rPr>
+                <w:b/>
+                <w:color w:val="0066CC"/>
+              </w:rPr>
+              <w:t>0.864</w:t>
+            </w:r>
+          </w:p>
+        </w:tc>
+        <w:tc>
+          <w:tcPr>
+            <w:tcW w:type="dxa" w:w="2160"/>
+          </w:tcPr>
+          <w:p>
+            <w:r>
+              <w:t>(0.431-1.732)</w:t>
+            </w:r>
+          </w:p>
+        </w:tc>
+        <w:tc>
+          <w:tcPr>
+            <w:tcW w:type="dxa" w:w="2160"/>
+          </w:tcPr>
+          <w:p>
+            <w:r>
+              <w:t>13.6% decrease</w:t>
+            </w:r>
+          </w:p>
+        </w:tc>
+      </w:tr>
+    </w:tbl>
+    <w:p>
+      <w:r>
+        <w:t>Note: These factors decrease the odds of being first-born (i.e., increase odds of being later-born). For example, an OR of 0.50 means the odds are 50% lower.</w:t>
+      </w:r>
+    </w:p>
+    <w:p>
+      <w:pPr>
+        <w:pStyle w:val="Heading2"/>
+      </w:pPr>
+      <w:r>
+        <w:t>Effect Strength Distribution</w:t>
       </w:r>
     </w:p>
     <w:tbl>
@@ -7965,75 +10197,33 @@
         <w:tblLook w:firstColumn="1" w:firstRow="1" w:lastColumn="0" w:lastRow="0" w:noHBand="0" w:noVBand="1" w:val="04A0"/>
       </w:tblPr>
       <w:tblGrid>
-        <w:gridCol w:w="1728"/>
-        <w:gridCol w:w="1728"/>
-        <w:gridCol w:w="1728"/>
-        <w:gridCol w:w="1728"/>
-        <w:gridCol w:w="1728"/>
+        <w:gridCol w:w="4320"/>
+        <w:gridCol w:w="4320"/>
       </w:tblGrid>
       <w:tr>
         <w:tc>
           <w:tcPr>
-            <w:tcW w:type="dxa" w:w="1728"/>
+            <w:tcW w:type="dxa" w:w="4320"/>
           </w:tcPr>
           <w:p>
             <w:r>
               <w:rPr>
                 <w:b/>
               </w:rPr>
-              <w:t>Strongest Positive Associations</w:t>
-            </w:r>
-          </w:p>
-        </w:tc>
-        <w:tc>
-          <w:tcPr>
-            <w:tcW w:type="dxa" w:w="1728"/>
+              <w:t>Effect Strength</w:t>
+            </w:r>
+          </w:p>
+        </w:tc>
+        <w:tc>
+          <w:tcPr>
+            <w:tcW w:type="dxa" w:w="4320"/>
           </w:tcPr>
           <w:p>
             <w:r>
               <w:rPr>
                 <w:b/>
               </w:rPr>
-              <w:t>OR (95% CI)</w:t>
-            </w:r>
-          </w:p>
-        </w:tc>
-        <w:tc>
-          <w:tcPr>
-            <w:tcW w:type="dxa" w:w="1728"/>
-          </w:tcPr>
-          <w:p>
-            <w:r>
-              <w:rPr>
-                <w:b/>
-              </w:rPr>
-              <w:t>Signif.</w:t>
-            </w:r>
-          </w:p>
-        </w:tc>
-        <w:tc>
-          <w:tcPr>
-            <w:tcW w:type="dxa" w:w="1728"/>
-          </w:tcPr>
-          <w:p>
-            <w:r>
-              <w:rPr>
-                <w:b/>
-              </w:rPr>
-              <w:t>Strongest Negative Associations</w:t>
-            </w:r>
-          </w:p>
-        </w:tc>
-        <w:tc>
-          <w:tcPr>
-            <w:tcW w:type="dxa" w:w="1728"/>
-          </w:tcPr>
-          <w:p>
-            <w:r>
-              <w:rPr>
-                <w:b/>
-              </w:rPr>
-              <w:t>OR (95% CI)</w:t>
+              <w:t>Number of Predictors</w:t>
             </w:r>
           </w:p>
         </w:tc>
@@ -8041,57 +10231,21 @@
       <w:tr>
         <w:tc>
           <w:tcPr>
-            <w:tcW w:type="dxa" w:w="1728"/>
-          </w:tcPr>
-          <w:p>
-            <w:r>
-              <w:t>race_mother_Other Foreigners</w:t>
-            </w:r>
-          </w:p>
-        </w:tc>
-        <w:tc>
-          <w:tcPr>
-            <w:tcW w:type="dxa" w:w="1728"/>
-          </w:tcPr>
-          <w:p>
-            <w:r>
-              <w:rPr>
-                <w:color w:val="CC6600"/>
-              </w:rPr>
-              <w:t>3.62 (1.07-12.15)</w:t>
-            </w:r>
-          </w:p>
-        </w:tc>
-        <w:tc>
-          <w:tcPr>
-            <w:tcW w:type="dxa" w:w="1728"/>
-          </w:tcPr>
-          <w:p>
-            <w:r>
-              <w:t>*</w:t>
-            </w:r>
-          </w:p>
-        </w:tc>
-        <w:tc>
-          <w:tcPr>
-            <w:tcW w:type="dxa" w:w="1728"/>
-          </w:tcPr>
-          <w:p>
-            <w:r>
-              <w:t>age_group_35+</w:t>
-            </w:r>
-          </w:p>
-        </w:tc>
-        <w:tc>
-          <w:tcPr>
-            <w:tcW w:type="dxa" w:w="1728"/>
-          </w:tcPr>
-          <w:p>
-            <w:r>
-              <w:rPr>
-                <w:color w:val="0066CC"/>
-              </w:rPr>
-              <w:t>0.01 (0.01-0.02)</w:t>
+            <w:tcW w:type="dxa" w:w="4320"/>
+          </w:tcPr>
+          <w:p>
+            <w:r>
+              <w:t>Very Strong</w:t>
+            </w:r>
+          </w:p>
+        </w:tc>
+        <w:tc>
+          <w:tcPr>
+            <w:tcW w:type="dxa" w:w="4320"/>
+          </w:tcPr>
+          <w:p>
+            <w:r>
+              <w:t>5</w:t>
             </w:r>
           </w:p>
         </w:tc>
@@ -8099,55 +10253,21 @@
       <w:tr>
         <w:tc>
           <w:tcPr>
-            <w:tcW w:type="dxa" w:w="1728"/>
-          </w:tcPr>
-          <w:p>
-            <w:r>
-              <w:t>race_mother_Pakistan Moor</w:t>
-            </w:r>
-          </w:p>
-        </w:tc>
-        <w:tc>
-          <w:tcPr>
-            <w:tcW w:type="dxa" w:w="1728"/>
-          </w:tcPr>
-          <w:p>
-            <w:r>
-              <w:rPr>
-                <w:color w:val="CC6600"/>
-              </w:rPr>
-              <w:t>2.27 (0.67-7.74)</w:t>
-            </w:r>
-          </w:p>
-        </w:tc>
-        <w:tc>
-          <w:tcPr>
-            <w:tcW w:type="dxa" w:w="1728"/>
-          </w:tcPr>
-          <w:p>
-            <w:r/>
-          </w:p>
-        </w:tc>
-        <w:tc>
-          <w:tcPr>
-            <w:tcW w:type="dxa" w:w="1728"/>
-          </w:tcPr>
-          <w:p>
-            <w:r>
-              <w:t>age_group_30-34</w:t>
-            </w:r>
-          </w:p>
-        </w:tc>
-        <w:tc>
-          <w:tcPr>
-            <w:tcW w:type="dxa" w:w="1728"/>
-          </w:tcPr>
-          <w:p>
-            <w:r>
-              <w:rPr>
-                <w:color w:val="0066CC"/>
-              </w:rPr>
-              <w:t>0.03 (0.02-0.03)</w:t>
+            <w:tcW w:type="dxa" w:w="4320"/>
+          </w:tcPr>
+          <w:p>
+            <w:r>
+              <w:t>Strong</w:t>
+            </w:r>
+          </w:p>
+        </w:tc>
+        <w:tc>
+          <w:tcPr>
+            <w:tcW w:type="dxa" w:w="4320"/>
+          </w:tcPr>
+          <w:p>
+            <w:r>
+              <w:t>4</w:t>
             </w:r>
           </w:p>
         </w:tc>
@@ -8155,55 +10275,21 @@
       <w:tr>
         <w:tc>
           <w:tcPr>
-            <w:tcW w:type="dxa" w:w="1728"/>
-          </w:tcPr>
-          <w:p>
-            <w:r>
-              <w:t>race_mother_Sinhalese</w:t>
-            </w:r>
-          </w:p>
-        </w:tc>
-        <w:tc>
-          <w:tcPr>
-            <w:tcW w:type="dxa" w:w="1728"/>
-          </w:tcPr>
-          <w:p>
-            <w:r>
-              <w:rPr>
-                <w:color w:val="CC6600"/>
-              </w:rPr>
-              <w:t>2.21 (0.70-6.98)</w:t>
-            </w:r>
-          </w:p>
-        </w:tc>
-        <w:tc>
-          <w:tcPr>
-            <w:tcW w:type="dxa" w:w="1728"/>
-          </w:tcPr>
-          <w:p>
-            <w:r/>
-          </w:p>
-        </w:tc>
-        <w:tc>
-          <w:tcPr>
-            <w:tcW w:type="dxa" w:w="1728"/>
-          </w:tcPr>
-          <w:p>
-            <w:r>
-              <w:t>age_group_25-29</w:t>
-            </w:r>
-          </w:p>
-        </w:tc>
-        <w:tc>
-          <w:tcPr>
-            <w:tcW w:type="dxa" w:w="1728"/>
-          </w:tcPr>
-          <w:p>
-            <w:r>
-              <w:rPr>
-                <w:color w:val="0066CC"/>
-              </w:rPr>
-              <w:t>0.06 (0.06-0.07)</w:t>
+            <w:tcW w:type="dxa" w:w="4320"/>
+          </w:tcPr>
+          <w:p>
+            <w:r>
+              <w:t>Moderate</w:t>
+            </w:r>
+          </w:p>
+        </w:tc>
+        <w:tc>
+          <w:tcPr>
+            <w:tcW w:type="dxa" w:w="4320"/>
+          </w:tcPr>
+          <w:p>
+            <w:r>
+              <w:t>1</w:t>
             </w:r>
           </w:p>
         </w:tc>
@@ -8211,111 +10297,21 @@
       <w:tr>
         <w:tc>
           <w:tcPr>
-            <w:tcW w:type="dxa" w:w="1728"/>
-          </w:tcPr>
-          <w:p>
-            <w:r>
-              <w:t>race_mother_Burgher</w:t>
-            </w:r>
-          </w:p>
-        </w:tc>
-        <w:tc>
-          <w:tcPr>
-            <w:tcW w:type="dxa" w:w="1728"/>
-          </w:tcPr>
-          <w:p>
-            <w:r>
-              <w:rPr>
-                <w:color w:val="CC6600"/>
-              </w:rPr>
-              <w:t>2.16 (0.67-6.97)</w:t>
-            </w:r>
-          </w:p>
-        </w:tc>
-        <w:tc>
-          <w:tcPr>
-            <w:tcW w:type="dxa" w:w="1728"/>
-          </w:tcPr>
-          <w:p>
-            <w:r/>
-          </w:p>
-        </w:tc>
-        <w:tc>
-          <w:tcPr>
-            <w:tcW w:type="dxa" w:w="1728"/>
-          </w:tcPr>
-          <w:p>
-            <w:r>
-              <w:t>age_group_20-24</w:t>
-            </w:r>
-          </w:p>
-        </w:tc>
-        <w:tc>
-          <w:tcPr>
-            <w:tcW w:type="dxa" w:w="1728"/>
-          </w:tcPr>
-          <w:p>
-            <w:r>
-              <w:rPr>
-                <w:color w:val="0066CC"/>
-              </w:rPr>
-              <w:t>0.18 (0.17-0.19)</w:t>
-            </w:r>
-          </w:p>
-        </w:tc>
-      </w:tr>
-      <w:tr>
-        <w:tc>
-          <w:tcPr>
-            <w:tcW w:type="dxa" w:w="1728"/>
-          </w:tcPr>
-          <w:p>
-            <w:r>
-              <w:t>race_mother_Other Srilankans</w:t>
-            </w:r>
-          </w:p>
-        </w:tc>
-        <w:tc>
-          <w:tcPr>
-            <w:tcW w:type="dxa" w:w="1728"/>
-          </w:tcPr>
-          <w:p>
-            <w:r>
-              <w:rPr>
-                <w:color w:val="CC6600"/>
-              </w:rPr>
-              <w:t>2.06 (0.55-7.77)</w:t>
-            </w:r>
-          </w:p>
-        </w:tc>
-        <w:tc>
-          <w:tcPr>
-            <w:tcW w:type="dxa" w:w="1728"/>
-          </w:tcPr>
-          <w:p>
-            <w:r/>
-          </w:p>
-        </w:tc>
-        <w:tc>
-          <w:tcPr>
-            <w:tcW w:type="dxa" w:w="1728"/>
-          </w:tcPr>
-          <w:p>
-            <w:r>
-              <w:t>multiple_birth_Triplets</w:t>
-            </w:r>
-          </w:p>
-        </w:tc>
-        <w:tc>
-          <w:tcPr>
-            <w:tcW w:type="dxa" w:w="1728"/>
-          </w:tcPr>
-          <w:p>
-            <w:r>
-              <w:rPr>
-                <w:color w:val="0066CC"/>
-              </w:rPr>
-              <w:t>0.86 (0.43-1.73)</w:t>
+            <w:tcW w:type="dxa" w:w="4320"/>
+          </w:tcPr>
+          <w:p>
+            <w:r>
+              <w:t>Weak</w:t>
+            </w:r>
+          </w:p>
+        </w:tc>
+        <w:tc>
+          <w:tcPr>
+            <w:tcW w:type="dxa" w:w="4320"/>
+          </w:tcPr>
+          <w:p>
+            <w:r>
+              <w:t>10</w:t>
             </w:r>
           </w:p>
         </w:tc>
@@ -8326,7 +10322,7 @@
         <w:pStyle w:val="Heading2"/>
       </w:pPr>
       <w:r>
-        <w:t>Strongest Effects</w:t>
+        <w:t>Effect Size Interpretation Guidelines</w:t>
       </w:r>
     </w:p>
     <w:p>
@@ -8334,59 +10330,27 @@
         <w:rPr>
           <w:b/>
         </w:rPr>
-        <w:t xml:space="preserve">Strongest Positive Effect: </w:t>
+        <w:t>Odds Ratio interpretation (based on absolute deviation from 1):</w:t>
+        <w:br/>
       </w:r>
       <w:r>
-        <w:t>race_mother_Other Foreigners (OR = 3.615) - This predictor has the largest positive association with being first-born.</w:t>
-      </w:r>
-    </w:p>
-    <w:p>
-      <w:r>
-        <w:rPr>
-          <w:b/>
-        </w:rPr>
-        <w:t xml:space="preserve">Strongest Negative Effect: </w:t>
+        <w:t>• OR = 1.00: No effect</w:t>
+        <w:br/>
       </w:r>
       <w:r>
-        <w:t>age_group_35+ (OR = 0.015) - This predictor has the largest negative association with being first-born (i.e., strongest association with being later-born).</w:t>
+        <w:t>• 1.00 &lt; OR ≤ 1.50 or 0.67 ≤ OR &lt; 1.00: Weak effect</w:t>
+        <w:br/>
       </w:r>
-    </w:p>
-    <w:p>
-      <w:pPr>
-        <w:pStyle w:val="Heading2"/>
-      </w:pPr>
       <w:r>
-        <w:t>Note on Interpretation</w:t>
+        <w:t>• 1.50 &lt; OR ≤ 2.00 or 0.50 ≤ OR &lt; 0.67: Moderate effect</w:t>
+        <w:br/>
       </w:r>
-    </w:p>
-    <w:p>
       <w:r>
-        <w:t>The forest plot displays odds ratios on a logarithmic scale. Confidence intervals that do not cross the vertical line at OR=1 indicate statistically significant associations at the 5% significance level. The points represent the point estimates, while the horizontal bars represent the 95% confidence interval width.</w:t>
+        <w:t>• 2.00 &lt; OR ≤ 3.00 or 0.33 ≤ OR &lt; 0.50: Strong effect</w:t>
         <w:br/>
-        <w:br/>
-        <w:t>The purple color scheme (#534AB7 for points, #3C3489 for error bars) was used for the binary logistic model to distinguish it from previous analyses.</w:t>
       </w:r>
-    </w:p>
-    <w:p>
-      <w:pPr>
-        <w:pStyle w:val="Heading2"/>
-      </w:pPr>
       <w:r>
-        <w:t>Clinical/Substantive Significance</w:t>
-      </w:r>
-    </w:p>
-    <w:p>
-      <w:r>
-        <w:t>When interpreting forest plots, consider both statistical and substantive significance:</w:t>
-        <w:br/>
-        <w:br/>
-        <w:t>• OR between 0.95 and 1.05: Minimal practical effect even if statistically significant</w:t>
-        <w:br/>
-        <w:t>• OR between 0.67 and 1.50: Small to moderate practical effect</w:t>
-        <w:br/>
-        <w:t>• OR &lt; 0.67 or &gt; 1.50: Substantial practical effect</w:t>
-        <w:br/>
-        <w:t>• OR &lt; 0.50 or &gt; 2.00: Large practical effect</w:t>
+        <w:t>• OR &gt; 3.00 or OR &lt; 0.33: Very strong effect</w:t>
         <w:br/>
       </w:r>
     </w:p>
@@ -8395,24 +10359,12 @@
         <w:pStyle w:val="Heading2"/>
       </w:pPr>
       <w:r>
-        <w:t>Saved Files</w:t>
+        <w:t>Confidence Intervals</w:t>
       </w:r>
     </w:p>
     <w:p>
       <w:r>
-        <w:rPr>
-          <w:b/>
-        </w:rPr>
-        <w:t>The following image files were saved to disk:</w:t>
-        <w:br/>
-      </w:r>
-      <w:r>
-        <w:t>• fig7_binary_forest.png - Forest plot (150 DPI)</w:t>
-        <w:br/>
-      </w:r>
-      <w:r>
-        <w:t>• fig7_binary_forest_hd.png - High-resolution version for publication (600 DPI)</w:t>
-        <w:br/>
+        <w:t>The 95% confidence intervals provide the range of plausible values for the true odds ratio. If the confidence interval does not include 1.00, the effect is statistically significant at α = 0.05. Wider intervals indicate less precise estimates.</w:t>
       </w:r>
     </w:p>
     <w:p>
@@ -8420,18 +10372,20 @@
         <w:pStyle w:val="Heading2"/>
       </w:pPr>
       <w:r>
-        <w:t>Publication Quality</w:t>
+        <w:t>Practical Significance</w:t>
       </w:r>
     </w:p>
     <w:p>
       <w:r>
-        <w:t>The forest plot has been saved at 600 DPI for publication quality. For inclusion in manuscripts, consider the following:</w:t>
-        <w:br/>
-        <w:t>• Adjust figure size in the code if needed (currently 9×10.0 inches)</w:t>
-        <w:br/>
-        <w:t>• Colors can be customized to match journal guidelines</w:t>
-        <w:br/>
-        <w:t>• The plot uses a purple color scheme (#534AB7 for points, #3C3489 for error bars)</w:t>
+        <w:t>While statistical significance indicates whether an effect is likely to be real, practical significance considers the magnitude of the effect. Odds ratios close to 1.00 (e.g., between 0.95 and 1.05) may be statistically significant with large sample sizes but have limited practical importance.</w:t>
+      </w:r>
+    </w:p>
+    <w:p>
+      <w:pPr>
+        <w:pStyle w:val="IntenseQuote"/>
+      </w:pPr>
+      <w:r>
+        <w:t>📎 The odds ratios have been exported to Excel: model3_binary_OR.xlsx</w:t>
       </w:r>
     </w:p>
     <w:p>
@@ -8479,7 +10433,7 @@
         <w:drawing>
           <wp:inline xmlns:a="http://schemas.openxmlformats.org/drawingml/2006/main" xmlns:pic="http://schemas.openxmlformats.org/drawingml/2006/picture">
             <wp:extent cx="5029200" cy="4191000"/>
-            <wp:docPr id="2" name="Picture 2"/>
+            <wp:docPr id="1" name="Picture 1"/>
             <wp:cNvGraphicFramePr>
               <a:graphicFrameLocks noChangeAspect="1"/>
             </wp:cNvGraphicFramePr>
@@ -8491,7 +10445,7 @@
                     <pic:cNvPicPr/>
                   </pic:nvPicPr>
                   <pic:blipFill>
-                    <a:blip r:embed="rId10"/>
+                    <a:blip r:embed="rId9"/>
                     <a:stretch>
                       <a:fillRect/>
                     </a:stretch>
@@ -9166,7 +11120,7 @@
         <w:drawing>
           <wp:inline xmlns:a="http://schemas.openxmlformats.org/drawingml/2006/main" xmlns:pic="http://schemas.openxmlformats.org/drawingml/2006/picture">
             <wp:extent cx="5029200" cy="4023360"/>
-            <wp:docPr id="3" name="Picture 3"/>
+            <wp:docPr id="2" name="Picture 2"/>
             <wp:cNvGraphicFramePr>
               <a:graphicFrameLocks noChangeAspect="1"/>
             </wp:cNvGraphicFramePr>
@@ -9178,7 +11132,7 @@
                     <pic:cNvPicPr/>
                   </pic:nvPicPr>
                   <pic:blipFill>
-                    <a:blip r:embed="rId11"/>
+                    <a:blip r:embed="rId10"/>
                     <a:stretch>
                       <a:fillRect/>
                     </a:stretch>

</xml_diff>